<commit_message>
Manuscript: follow the journal's Guide for Authors
- abstract at 249 words with abbreviations defined; every table cited
- ethics statement for the public, de-identified CHB-MIT data
- the software release and the CHB-MIT dataset cited as references
  (Option C data policy); full author lists and DOIs where known;
  preprints marked
- figure captions open with a brief title; figure text 7 pt or larger
- graphical abstract (landscape, 2499 px wide) and highlights.docx
- no underlining in the Word file
- cover letter addresses the scope rule on reanalysed public data and
  software; checklist rewritten against the guide
</commit_message>
<xml_diff>
--- a/paper/jnm/manuscript.docx
+++ b/paper/jnm/manuscript.docx
@@ -164,7 +164,7 @@
         <w:t xml:space="preserve"> </w:t>
       </w:r>
       <w:r>
-        <w:t xml:space="preserve">language models now summarise such output with no check on the numbers they</w:t>
+        <w:t xml:space="preserve">language models summarise such output with no check on the numbers they</w:t>
       </w:r>
       <w:r>
         <w:t xml:space="preserve"> </w:t>
@@ -200,7 +200,13 @@
         <w:t xml:space="preserve"> </w:t>
       </w:r>
       <w:r>
-        <w:t xml:space="preserve">debiased wPLI, an unsupervised rhythmic-event detector) was built under a</w:t>
+        <w:t xml:space="preserve">debiased weighted phase-lag index, an unsupervised rhythmic-event detector)</w:t>
+      </w:r>
+      <w:r>
+        <w:t xml:space="preserve"> </w:t>
+      </w:r>
+      <w:r>
+        <w:t xml:space="preserve">was built under a</w:t>
       </w:r>
       <w:r>
         <w:t xml:space="preserve"> </w:t>
@@ -254,13 +260,13 @@
         <w:t xml:space="preserve"> </w:t>
       </w:r>
       <w:r>
-        <w:t xml:space="preserve">1/f confound the project set out to avoid; on a held-out CHB-MIT subject the</w:t>
-      </w:r>
-      <w:r>
-        <w:t xml:space="preserve"> </w:t>
-      </w:r>
-      <w:r>
-        <w:t xml:space="preserve">frozen detector found 4 of 7 seizures at 3.3 false detections per hour. A</w:t>
+        <w:t xml:space="preserve">1/f confound the project set out to avoid; on a held-out subject of the</w:t>
+      </w:r>
+      <w:r>
+        <w:t xml:space="preserve"> </w:t>
+      </w:r>
+      <w:r>
+        <w:t xml:space="preserve">public CHB-MIT database the frozen detector found 4 of 7 seizures at 3.3 false detections per hour. A</w:t>
       </w:r>
       <w:r>
         <w:t xml:space="preserve"> </w:t>
@@ -314,13 +320,13 @@
         <w:t xml:space="preserve"> </w:t>
       </w:r>
       <w:r>
-        <w:t xml:space="preserve">reach far higher sensitivity; the contribution is a protocol and an evidence</w:t>
-      </w:r>
-      <w:r>
-        <w:t xml:space="preserve"> </w:t>
-      </w:r>
-      <w:r>
-        <w:t xml:space="preserve">trail that make such claims checkable, not a better detector.</w:t>
+        <w:t xml:space="preserve">reach far higher sensitivity; the contribution is a protocol that makes such</w:t>
+      </w:r>
+      <w:r>
+        <w:t xml:space="preserve"> </w:t>
+      </w:r>
+      <w:r>
+        <w:t xml:space="preserve">claims checkable, not a better detector.</w:t>
       </w:r>
     </w:p>
     <w:p>
@@ -856,7 +862,13 @@
         <w:pStyle w:val="BodyText"/>
       </w:pPr>
       <w:r>
-        <w:t xml:space="preserve">The output is a JSON file of metrics that is byte-identical across runs, a</w:t>
+        <w:t xml:space="preserve">The software (Mbote, 2026b) is open source. The output is a JSON file of</w:t>
+      </w:r>
+      <w:r>
+        <w:t xml:space="preserve"> </w:t>
+      </w:r>
+      <w:r>
+        <w:t xml:space="preserve">metrics that is byte-identical across runs, a</w:t>
       </w:r>
       <w:r>
         <w:t xml:space="preserve"> </w:t>
@@ -1600,6 +1612,50 @@
         <w:t xml:space="preserve">per hour are reported with a Poisson upper bound.</w:t>
       </w:r>
     </w:p>
+    <w:p>
+      <w:pPr>
+        <w:pStyle w:val="BodyText"/>
+      </w:pPr>
+      <w:r>
+        <w:t xml:space="preserve">Ethics statement: this study used only the publicly available, de-identified</w:t>
+      </w:r>
+      <w:r>
+        <w:t xml:space="preserve"> </w:t>
+      </w:r>
+      <w:r>
+        <w:t xml:space="preserve">CHB-MIT Scalp EEG Database (Shoeb and Guttag, 2010), distributed by</w:t>
+      </w:r>
+      <w:r>
+        <w:t xml:space="preserve"> </w:t>
+      </w:r>
+      <w:r>
+        <w:t xml:space="preserve">PhysioNet under the Open Data Commons Attribution License v1.0. The</w:t>
+      </w:r>
+      <w:r>
+        <w:t xml:space="preserve"> </w:t>
+      </w:r>
+      <w:r>
+        <w:t xml:space="preserve">recordings were collected and de-identified by the database’s creators</w:t>
+      </w:r>
+      <w:r>
+        <w:t xml:space="preserve"> </w:t>
+      </w:r>
+      <w:r>
+        <w:t xml:space="preserve">(Shoeb, 2009); no new data were collected from human participants and no</w:t>
+      </w:r>
+      <w:r>
+        <w:t xml:space="preserve"> </w:t>
+      </w:r>
+      <w:r>
+        <w:t xml:space="preserve">participant can be identified, so no further ethical approval was sought for</w:t>
+      </w:r>
+      <w:r>
+        <w:t xml:space="preserve"> </w:t>
+      </w:r>
+      <w:r>
+        <w:t xml:space="preserve">this secondary analysis.</w:t>
+      </w:r>
+    </w:p>
     <w:bookmarkEnd w:id="25"/>
     <w:bookmarkStart w:id="26" w:name="explanations-and-the-claim-checker"/>
     <w:p>
@@ -1779,7 +1835,7 @@
         <w:t xml:space="preserve"> </w:t>
       </w:r>
       <w:r>
-        <w:t xml:space="preserve">agents on biomedical engineering tasks (Mbote, 2026).</w:t>
+        <w:t xml:space="preserve">agents on biomedical engineering tasks (Mbote, 2026a).</w:t>
       </w:r>
     </w:p>
     <w:p>
@@ -2026,6 +2082,14 @@
       </w:pPr>
       <w:r>
         <w:t xml:space="preserve">3.1 Confirmatory outcomes</w:t>
+      </w:r>
+    </w:p>
+    <w:p>
+      <w:pPr>
+        <w:pStyle w:val="FirstParagraph"/>
+      </w:pPr>
+      <w:r>
+        <w:t xml:space="preserve">Table 2 lists the outcome of every pre-registered hypothesis.</w:t>
       </w:r>
     </w:p>
     <w:p>
@@ -3147,6 +3211,14 @@
     </w:p>
     <w:p>
       <w:pPr>
+        <w:pStyle w:val="FirstParagraph"/>
+      </w:pPr>
+      <w:r>
+        <w:t xml:space="preserve">Table 3 summarises both runs.</w:t>
+      </w:r>
+    </w:p>
+    <w:p>
+      <w:pPr>
         <w:pStyle w:val="TableCaption"/>
       </w:pPr>
       <w:r>
@@ -4629,19 +4701,31 @@
         <w:pStyle w:val="FirstParagraph"/>
       </w:pPr>
       <w:r>
-        <w:t xml:space="preserve">Donoghue, T., Haller, M., Peterson, E.J., et al., 2020. Parameterizing</w:t>
-      </w:r>
-      <w:r>
-        <w:t xml:space="preserve"> </w:t>
-      </w:r>
-      <w:r>
-        <w:t xml:space="preserve">neural power spectra into periodic and aperiodic components. Nat. Neurosci.</w:t>
-      </w:r>
-      <w:r>
-        <w:t xml:space="preserve"> </w:t>
-      </w:r>
-      <w:r>
-        <w:t xml:space="preserve">23, 1655–1665.</w:t>
+        <w:t xml:space="preserve">Donoghue, T., Haller, M., Peterson, E.J., Varma, P., Sebastian, P., Gao, R.,</w:t>
+      </w:r>
+      <w:r>
+        <w:t xml:space="preserve"> </w:t>
+      </w:r>
+      <w:r>
+        <w:t xml:space="preserve">Noto, T., Lara, A.H., Wallis, J.D., Knight, R.T., Shestyuk, A., Voytek, B.,</w:t>
+      </w:r>
+      <w:r>
+        <w:t xml:space="preserve"> </w:t>
+      </w:r>
+      <w:r>
+        <w:t xml:space="preserve">2020. Parameterizing neural power spectra into periodic and aperiodic</w:t>
+      </w:r>
+      <w:r>
+        <w:t xml:space="preserve"> </w:t>
+      </w:r>
+      <w:r>
+        <w:t xml:space="preserve">components. Nat. Neurosci. 23, 1655–1665.</w:t>
+      </w:r>
+      <w:r>
+        <w:t xml:space="preserve"> </w:t>
+      </w:r>
+      <w:r>
+        <w:t xml:space="preserve">https://doi.org/10.1038/s41593-020-00744-x</w:t>
       </w:r>
     </w:p>
     <w:p>
@@ -4675,19 +4759,31 @@
         <w:pStyle w:val="BodyText"/>
       </w:pPr>
       <w:r>
-        <w:t xml:space="preserve">Goldberger, A.L., Amaral, L.A.N., Glass, L., et al., 2000. PhysioBank,</w:t>
-      </w:r>
-      <w:r>
-        <w:t xml:space="preserve"> </w:t>
-      </w:r>
-      <w:r>
-        <w:t xml:space="preserve">PhysioToolkit, and PhysioNet: components of a new research resource for</w:t>
-      </w:r>
-      <w:r>
-        <w:t xml:space="preserve"> </w:t>
-      </w:r>
-      <w:r>
-        <w:t xml:space="preserve">complex physiologic signals. Circulation 101, e215–e220.</w:t>
+        <w:t xml:space="preserve">Goldberger, A.L., Amaral, L.A.N., Glass, L., Hausdorff, J.M., Ivanov, P.Ch.,</w:t>
+      </w:r>
+      <w:r>
+        <w:t xml:space="preserve"> </w:t>
+      </w:r>
+      <w:r>
+        <w:t xml:space="preserve">Mark, R.G., Mietus, J.E., Moody, G.B., Peng, C.-K., Stanley, H.E., 2000.</w:t>
+      </w:r>
+      <w:r>
+        <w:t xml:space="preserve"> </w:t>
+      </w:r>
+      <w:r>
+        <w:t xml:space="preserve">PhysioBank, PhysioToolkit, and PhysioNet: components of a new research</w:t>
+      </w:r>
+      <w:r>
+        <w:t xml:space="preserve"> </w:t>
+      </w:r>
+      <w:r>
+        <w:t xml:space="preserve">resource for complex physiologic signals. Circulation 101, e215–e220.</w:t>
+      </w:r>
+      <w:r>
+        <w:t xml:space="preserve"> </w:t>
+      </w:r>
+      <w:r>
+        <w:t xml:space="preserve">https://doi.org/10.1161/01.CIR.101.23.e215</w:t>
       </w:r>
     </w:p>
     <w:p>
@@ -4703,19 +4799,25 @@
       <w:r>
         <w:t xml:space="preserve">machine-learning-based science. Patterns 4, 100804.</w:t>
       </w:r>
+      <w:r>
+        <w:t xml:space="preserve"> </w:t>
+      </w:r>
+      <w:r>
+        <w:t xml:space="preserve">https://doi.org/10.1016/j.patter.2023.100804</w:t>
+      </w:r>
     </w:p>
     <w:p>
       <w:pPr>
         <w:pStyle w:val="BodyText"/>
       </w:pPr>
       <w:r>
-        <w:t xml:space="preserve">Mbote, S.N., 2026. Validating the graders: physics-aware rewards for AI</w:t>
-      </w:r>
-      <w:r>
-        <w:t xml:space="preserve"> </w:t>
-      </w:r>
-      <w:r>
-        <w:t xml:space="preserve">agents on biomedical engineering tasks. Preprint, Zenodo.</w:t>
+        <w:t xml:space="preserve">Mbote, S.N., 2026a. Validating the graders: physics-aware rewards for AI</w:t>
+      </w:r>
+      <w:r>
+        <w:t xml:space="preserve"> </w:t>
+      </w:r>
+      <w:r>
+        <w:t xml:space="preserve">agents on biomedical engineering tasks [preprint]. Zenodo.</w:t>
       </w:r>
       <w:r>
         <w:t xml:space="preserve"> </w:t>
@@ -4729,19 +4831,19 @@
         <w:pStyle w:val="BodyText"/>
       </w:pPr>
       <w:r>
-        <w:t xml:space="preserve">Nolte, G., Bai, O., Wheaton, L., et al., 2004. Identifying true brain</w:t>
-      </w:r>
-      <w:r>
-        <w:t xml:space="preserve"> </w:t>
-      </w:r>
-      <w:r>
-        <w:t xml:space="preserve">interaction from EEG data using the imaginary part of coherency. Clin.</w:t>
-      </w:r>
-      <w:r>
-        <w:t xml:space="preserve"> </w:t>
-      </w:r>
-      <w:r>
-        <w:t xml:space="preserve">Neurophysiol. 115, 2292–2307.</w:t>
+        <w:t xml:space="preserve">Mbote, S.N., 2026b. NeuroSignal: a validation-first EEG report pipeline</w:t>
+      </w:r>
+      <w:r>
+        <w:t xml:space="preserve"> </w:t>
+      </w:r>
+      <w:r>
+        <w:t xml:space="preserve">with provenance-checked explanations, version 0.1.2 [software]. Zenodo.</w:t>
+      </w:r>
+      <w:r>
+        <w:t xml:space="preserve"> </w:t>
+      </w:r>
+      <w:r>
+        <w:t xml:space="preserve">https://doi.org/10.5281/zenodo.23716723</w:t>
       </w:r>
     </w:p>
     <w:p>
@@ -4749,6 +4851,32 @@
         <w:pStyle w:val="BodyText"/>
       </w:pPr>
       <w:r>
+        <w:t xml:space="preserve">Nolte, G., Bai, O., Wheaton, L., Mari, Z., Vorbach, S., Hallett, M., 2004.</w:t>
+      </w:r>
+      <w:r>
+        <w:t xml:space="preserve"> </w:t>
+      </w:r>
+      <w:r>
+        <w:t xml:space="preserve">Identifying true brain interaction from EEG data using the imaginary part</w:t>
+      </w:r>
+      <w:r>
+        <w:t xml:space="preserve"> </w:t>
+      </w:r>
+      <w:r>
+        <w:t xml:space="preserve">of coherency. Clin. Neurophysiol. 115, 2292–2307.</w:t>
+      </w:r>
+      <w:r>
+        <w:t xml:space="preserve"> </w:t>
+      </w:r>
+      <w:r>
+        <w:t xml:space="preserve">https://doi.org/10.1016/j.clinph.2004.04.029</w:t>
+      </w:r>
+    </w:p>
+    <w:p>
+      <w:pPr>
+        <w:pStyle w:val="BodyText"/>
+      </w:pPr>
+      <w:r>
         <w:t xml:space="preserve">Nosek, B.A., Ebersole, C.R., DeHaven, A.C., Mellor, D.T., 2018. The</w:t>
       </w:r>
       <w:r>
@@ -4757,6 +4885,12 @@
       <w:r>
         <w:t xml:space="preserve">preregistration revolution. Proc. Natl. Acad. Sci. U. S. A. 115, 2600–2606.</w:t>
       </w:r>
+      <w:r>
+        <w:t xml:space="preserve"> </w:t>
+      </w:r>
+      <w:r>
+        <w:t xml:space="preserve">https://doi.org/10.1073/pnas.1708274114</w:t>
+      </w:r>
     </w:p>
     <w:p>
       <w:pPr>
@@ -4777,6 +4911,12 @@
       <w:r>
         <w:t xml:space="preserve">benchmarking study. IEEE Trans. Neural Syst. Rehabil. Eng. 28, 1081–1090.</w:t>
       </w:r>
+      <w:r>
+        <w:t xml:space="preserve"> </w:t>
+      </w:r>
+      <w:r>
+        <w:t xml:space="preserve">https://doi.org/10.1109/TNSRE.2020.2980223</w:t>
+      </w:r>
     </w:p>
     <w:p>
       <w:pPr>
@@ -4803,6 +4943,20 @@
         <w:pStyle w:val="BodyText"/>
       </w:pPr>
       <w:r>
+        <w:t xml:space="preserve">[dataset] Shoeb, A., Guttag, J., 2010. CHB-MIT Scalp EEG Database, version</w:t>
+      </w:r>
+      <w:r>
+        <w:t xml:space="preserve"> </w:t>
+      </w:r>
+      <w:r>
+        <w:t xml:space="preserve">1.0.0. PhysioNet. https://doi.org/10.13026/C2K01R</w:t>
+      </w:r>
+    </w:p>
+    <w:p>
+      <w:pPr>
+        <w:pStyle w:val="BodyText"/>
+      </w:pPr>
+      <w:r>
         <w:t xml:space="preserve">Trübutschek, D., Yang, Y.F., Gianelli, C., et al., 2024. EEGManyPipes: a</w:t>
       </w:r>
       <w:r>
@@ -4843,6 +4997,12 @@
       <w:r>
         <w:t xml:space="preserve">sample-size bias. NeuroImage 55, 1548–1565.</w:t>
       </w:r>
+      <w:r>
+        <w:t xml:space="preserve"> </w:t>
+      </w:r>
+      <w:r>
+        <w:t xml:space="preserve">https://doi.org/10.1016/j.neuroimage.2011.01.055</w:t>
+      </w:r>
     </w:p>
     <w:p>
       <w:pPr>
@@ -4861,7 +5021,7 @@
         <w:t xml:space="preserve"> </w:t>
       </w:r>
       <w:r>
-        <w:t xml:space="preserve">34–46.</w:t>
+        <w:t xml:space="preserve">34–46. https://doi.org/10.1016/j.jneumeth.2014.08.002</w:t>
       </w:r>
     </w:p>
     <w:p>
@@ -4875,13 +5035,13 @@
         <w:t xml:space="preserve"> </w:t>
       </w:r>
       <w:r>
-        <w:t xml:space="preserve">Objective evaluation metrics for automatic classification of EEG events.</w:t>
-      </w:r>
-      <w:r>
-        <w:t xml:space="preserve"> </w:t>
-      </w:r>
-      <w:r>
-        <w:t xml:space="preserve">arXiv:1712.10107.</w:t>
+        <w:t xml:space="preserve">Objective evaluation metrics for automatic classification of EEG events</w:t>
+      </w:r>
+      <w:r>
+        <w:t xml:space="preserve"> </w:t>
+      </w:r>
+      <w:r>
+        <w:t xml:space="preserve">[preprint]. arXiv:1712.10107. https://doi.org/10.48550/arXiv.1712.10107</w:t>
       </w:r>
     </w:p>
     <w:bookmarkEnd w:id="49"/>
@@ -4954,7 +5114,7 @@
         <w:t xml:space="preserve"> </w:t>
       </w:r>
       <w:r>
-        <w:t xml:space="preserve">Overview. (A) The pipeline: each stage writes into a metrics</w:t>
+        <w:t xml:space="preserve">Pipeline, citation contract and validation protocol. (A) The pipeline: each stage writes into a metrics</w:t>
       </w:r>
       <w:r>
         <w:t xml:space="preserve"> </w:t>
@@ -4994,7 +5154,7 @@
       <w:r>
         <w:drawing>
           <wp:inline>
-            <wp:extent cx="5334000" cy="1939207"/>
+            <wp:extent cx="5334000" cy="1925837"/>
             <wp:effectExtent b="0" l="0" r="0" t="0"/>
             <wp:docPr descr="" title="" id="54" name="Picture"/>
             <a:graphic>
@@ -5015,7 +5175,7 @@
                   <pic:spPr bwMode="auto">
                     <a:xfrm>
                       <a:off x="0" y="0"/>
-                      <a:ext cx="5334000" cy="1939207"/>
+                      <a:ext cx="5334000" cy="1925837"/>
                     </a:xfrm>
                     <a:prstGeom prst="rect">
                       <a:avLst/>
@@ -5047,7 +5207,7 @@
         <w:t xml:space="preserve"> </w:t>
       </w:r>
       <w:r>
-        <w:t xml:space="preserve">Detector performance. (A) Sensitivity against false detections</w:t>
+        <w:t xml:space="preserve">Detector performance on synthetic and real recordings. (A) Sensitivity against false detections</w:t>
       </w:r>
       <w:r>
         <w:t xml:space="preserve"> </w:t>
@@ -5105,7 +5265,7 @@
       <w:r>
         <w:drawing>
           <wp:inline>
-            <wp:extent cx="2667000" cy="1989546"/>
+            <wp:extent cx="2667000" cy="1977386"/>
             <wp:effectExtent b="0" l="0" r="0" t="0"/>
             <wp:docPr descr="" title="" id="57" name="Picture"/>
             <a:graphic>
@@ -5126,7 +5286,7 @@
                   <pic:spPr bwMode="auto">
                     <a:xfrm>
                       <a:off x="0" y="0"/>
-                      <a:ext cx="2667000" cy="1989546"/>
+                      <a:ext cx="2667000" cy="1977386"/>
                     </a:xfrm>
                     <a:prstGeom prst="rect">
                       <a:avLst/>
@@ -5158,7 +5318,7 @@
         <w:t xml:space="preserve"> </w:t>
       </w:r>
       <w:r>
-        <w:t xml:space="preserve">Small-sample bias of plain wPLI under pure volume conduction (six</w:t>
+        <w:t xml:space="preserve">Small-sample bias of plain wPLI. Pure volume conduction (six</w:t>
       </w:r>
       <w:r>
         <w:t xml:space="preserve"> </w:t>
@@ -5192,7 +5352,7 @@
       <w:r>
         <w:drawing>
           <wp:inline>
-            <wp:extent cx="4000500" cy="1646266"/>
+            <wp:extent cx="4000500" cy="1604517"/>
             <wp:effectExtent b="0" l="0" r="0" t="0"/>
             <wp:docPr descr="" title="" id="60" name="Picture"/>
             <a:graphic>
@@ -5213,7 +5373,7 @@
                   <pic:spPr bwMode="auto">
                     <a:xfrm>
                       <a:off x="0" y="0"/>
-                      <a:ext cx="4000500" cy="1646266"/>
+                      <a:ext cx="4000500" cy="1604517"/>
                     </a:xfrm>
                     <a:prstGeom prst="rect">
                       <a:avLst/>
@@ -5285,7 +5445,7 @@
       <w:r>
         <w:drawing>
           <wp:inline>
-            <wp:extent cx="5334000" cy="2016018"/>
+            <wp:extent cx="5334000" cy="1968248"/>
             <wp:effectExtent b="0" l="0" r="0" t="0"/>
             <wp:docPr descr="" title="" id="63" name="Picture"/>
             <a:graphic>
@@ -5306,7 +5466,7 @@
                   <pic:spPr bwMode="auto">
                     <a:xfrm>
                       <a:off x="0" y="0"/>
-                      <a:ext cx="5334000" cy="2016018"/>
+                      <a:ext cx="5334000" cy="1968248"/>
                     </a:xfrm>
                     <a:prstGeom prst="rect">
                       <a:avLst/>
@@ -5338,7 +5498,13 @@
         <w:t xml:space="preserve"> </w:t>
       </w:r>
       <w:r>
-        <w:t xml:space="preserve">The claim checker and language models. (A) Fraction of live</w:t>
+        <w:t xml:space="preserve">Claim checker under mutation, and language models under the</w:t>
+      </w:r>
+      <w:r>
+        <w:t xml:space="preserve"> </w:t>
+      </w:r>
+      <w:r>
+        <w:t xml:space="preserve">citation contract. (A) Fraction of live</w:t>
       </w:r>
       <w:r>
         <w:t xml:space="preserve"> </w:t>

</xml_diff>

<commit_message>
Abstract: fit the submission form's 250-word count
The form counts the section headings, so the abstract is now 237 words of
text and 246 with headings. Manuscript and Word file rebuilt.
</commit_message>
<xml_diff>
--- a/paper/jnm/manuscript.docx
+++ b/paper/jnm/manuscript.docx
@@ -164,13 +164,7 @@
         <w:t xml:space="preserve"> </w:t>
       </w:r>
       <w:r>
-        <w:t xml:space="preserve">language models summarise such output with no check on the numbers they</w:t>
-      </w:r>
-      <w:r>
-        <w:t xml:space="preserve"> </w:t>
-      </w:r>
-      <w:r>
-        <w:t xml:space="preserve">state.</w:t>
+        <w:t xml:space="preserve">language models summarise such output without checking its numbers.</w:t>
       </w:r>
     </w:p>
     <w:p>
@@ -188,25 +182,19 @@
         <w:t xml:space="preserve"> </w:t>
       </w:r>
       <w:r>
-        <w:t xml:space="preserve">An open, deterministic scalp-EEG pipeline (quality control,</w:t>
-      </w:r>
-      <w:r>
-        <w:t xml:space="preserve"> </w:t>
-      </w:r>
-      <w:r>
-        <w:t xml:space="preserve">zero-phase filtering, aperiodic and periodic spectral parameterisation,</w:t>
-      </w:r>
-      <w:r>
-        <w:t xml:space="preserve"> </w:t>
-      </w:r>
-      <w:r>
-        <w:t xml:space="preserve">debiased weighted phase-lag index, an unsupervised rhythmic-event detector)</w:t>
-      </w:r>
-      <w:r>
-        <w:t xml:space="preserve"> </w:t>
-      </w:r>
-      <w:r>
-        <w:t xml:space="preserve">was built under a</w:t>
+        <w:t xml:space="preserve">An open scalp-EEG pipeline (quality control, zero-phase</w:t>
+      </w:r>
+      <w:r>
+        <w:t xml:space="preserve"> </w:t>
+      </w:r>
+      <w:r>
+        <w:t xml:space="preserve">filtering, aperiodic and periodic spectral parameterisation, debiased</w:t>
+      </w:r>
+      <w:r>
+        <w:t xml:space="preserve"> </w:t>
+      </w:r>
+      <w:r>
+        <w:t xml:space="preserve">weighted phase-lag index, a rhythmic-event detector) was built under a</w:t>
       </w:r>
       <w:r>
         <w:t xml:space="preserve"> </w:t>
@@ -230,7 +218,7 @@
         <w:t xml:space="preserve"> </w:t>
       </w:r>
       <w:r>
-        <w:t xml:space="preserve">computed metric, which a rule-based checker verifies.</w:t>
+        <w:t xml:space="preserve">computed metric, verified by a rule-based checker.</w:t>
       </w:r>
     </w:p>
     <w:p>
@@ -260,43 +248,43 @@
         <w:t xml:space="preserve"> </w:t>
       </w:r>
       <w:r>
-        <w:t xml:space="preserve">1/f confound the project set out to avoid; on a held-out subject of the</w:t>
-      </w:r>
-      <w:r>
-        <w:t xml:space="preserve"> </w:t>
-      </w:r>
-      <w:r>
-        <w:t xml:space="preserve">public CHB-MIT database the frozen detector found 4 of 7 seizures at 3.3 false detections per hour. A</w:t>
-      </w:r>
-      <w:r>
-        <w:t xml:space="preserve"> </w:t>
-      </w:r>
-      <w:r>
-        <w:t xml:space="preserve">cloud language model met the citation contract on 30 of 30 recordings and a</w:t>
-      </w:r>
-      <w:r>
-        <w:t xml:space="preserve"> </w:t>
-      </w:r>
-      <w:r>
-        <w:t xml:space="preserve">small local model on 0 of 30, with all faulty text blocked. The checker as</w:t>
-      </w:r>
-      <w:r>
-        <w:t xml:space="preserve"> </w:t>
-      </w:r>
-      <w:r>
-        <w:t xml:space="preserve">first released missed 709 of 3334 mutated explanations; the corrected</w:t>
-      </w:r>
-      <w:r>
-        <w:t xml:space="preserve"> </w:t>
-      </w:r>
-      <w:r>
-        <w:t xml:space="preserve">checker caught all. A blinded audit found 3 of 20 accepted explanations</w:t>
-      </w:r>
-      <w:r>
-        <w:t xml:space="preserve"> </w:t>
-      </w:r>
-      <w:r>
-        <w:t xml:space="preserve">misleading (limit 2): correct numbers attached to the wrong concept.</w:t>
+        <w:t xml:space="preserve">1/f confound it targeted; on a held-out subject of the public CHB-MIT</w:t>
+      </w:r>
+      <w:r>
+        <w:t xml:space="preserve"> </w:t>
+      </w:r>
+      <w:r>
+        <w:t xml:space="preserve">database the frozen detector found 4 of 7 seizures at 3.3 false detections</w:t>
+      </w:r>
+      <w:r>
+        <w:t xml:space="preserve"> </w:t>
+      </w:r>
+      <w:r>
+        <w:t xml:space="preserve">per hour. A cloud language model met the citation contract on 30 of 30</w:t>
+      </w:r>
+      <w:r>
+        <w:t xml:space="preserve"> </w:t>
+      </w:r>
+      <w:r>
+        <w:t xml:space="preserve">recordings and a small local model on 0 of 30, with all faulty text blocked.</w:t>
+      </w:r>
+      <w:r>
+        <w:t xml:space="preserve"> </w:t>
+      </w:r>
+      <w:r>
+        <w:t xml:space="preserve">The first checker missed 709 of 3334 mutated explanations; the corrected one</w:t>
+      </w:r>
+      <w:r>
+        <w:t xml:space="preserve"> </w:t>
+      </w:r>
+      <w:r>
+        <w:t xml:space="preserve">caught all. A blinded audit found 3 of 20 accepted explanations misleading</w:t>
+      </w:r>
+      <w:r>
+        <w:t xml:space="preserve"> </w:t>
+      </w:r>
+      <w:r>
+        <w:t xml:space="preserve">(limit 2): correct numbers attached to the wrong concept.</w:t>
       </w:r>
     </w:p>
     <w:p>

</xml_diff>

<commit_message>
Abstract fitted to the form; manuscript submitted (#41)
* Abstract: fit the submission form's 250-word count

The form counts the section headings, so the abstract is now 237 words of
text and 246 with headings. Manuscript and Word file rebuilt.

* Roadmap: manuscript submitted to the Journal of Neuroscience Methods
</commit_message>
<xml_diff>
--- a/paper/jnm/manuscript.docx
+++ b/paper/jnm/manuscript.docx
@@ -164,13 +164,7 @@
         <w:t xml:space="preserve"> </w:t>
       </w:r>
       <w:r>
-        <w:t xml:space="preserve">language models summarise such output with no check on the numbers they</w:t>
-      </w:r>
-      <w:r>
-        <w:t xml:space="preserve"> </w:t>
-      </w:r>
-      <w:r>
-        <w:t xml:space="preserve">state.</w:t>
+        <w:t xml:space="preserve">language models summarise such output without checking its numbers.</w:t>
       </w:r>
     </w:p>
     <w:p>
@@ -188,25 +182,19 @@
         <w:t xml:space="preserve"> </w:t>
       </w:r>
       <w:r>
-        <w:t xml:space="preserve">An open, deterministic scalp-EEG pipeline (quality control,</w:t>
-      </w:r>
-      <w:r>
-        <w:t xml:space="preserve"> </w:t>
-      </w:r>
-      <w:r>
-        <w:t xml:space="preserve">zero-phase filtering, aperiodic and periodic spectral parameterisation,</w:t>
-      </w:r>
-      <w:r>
-        <w:t xml:space="preserve"> </w:t>
-      </w:r>
-      <w:r>
-        <w:t xml:space="preserve">debiased weighted phase-lag index, an unsupervised rhythmic-event detector)</w:t>
-      </w:r>
-      <w:r>
-        <w:t xml:space="preserve"> </w:t>
-      </w:r>
-      <w:r>
-        <w:t xml:space="preserve">was built under a</w:t>
+        <w:t xml:space="preserve">An open scalp-EEG pipeline (quality control, zero-phase</w:t>
+      </w:r>
+      <w:r>
+        <w:t xml:space="preserve"> </w:t>
+      </w:r>
+      <w:r>
+        <w:t xml:space="preserve">filtering, aperiodic and periodic spectral parameterisation, debiased</w:t>
+      </w:r>
+      <w:r>
+        <w:t xml:space="preserve"> </w:t>
+      </w:r>
+      <w:r>
+        <w:t xml:space="preserve">weighted phase-lag index, a rhythmic-event detector) was built under a</w:t>
       </w:r>
       <w:r>
         <w:t xml:space="preserve"> </w:t>
@@ -230,7 +218,7 @@
         <w:t xml:space="preserve"> </w:t>
       </w:r>
       <w:r>
-        <w:t xml:space="preserve">computed metric, which a rule-based checker verifies.</w:t>
+        <w:t xml:space="preserve">computed metric, verified by a rule-based checker.</w:t>
       </w:r>
     </w:p>
     <w:p>
@@ -260,43 +248,43 @@
         <w:t xml:space="preserve"> </w:t>
       </w:r>
       <w:r>
-        <w:t xml:space="preserve">1/f confound the project set out to avoid; on a held-out subject of the</w:t>
-      </w:r>
-      <w:r>
-        <w:t xml:space="preserve"> </w:t>
-      </w:r>
-      <w:r>
-        <w:t xml:space="preserve">public CHB-MIT database the frozen detector found 4 of 7 seizures at 3.3 false detections per hour. A</w:t>
-      </w:r>
-      <w:r>
-        <w:t xml:space="preserve"> </w:t>
-      </w:r>
-      <w:r>
-        <w:t xml:space="preserve">cloud language model met the citation contract on 30 of 30 recordings and a</w:t>
-      </w:r>
-      <w:r>
-        <w:t xml:space="preserve"> </w:t>
-      </w:r>
-      <w:r>
-        <w:t xml:space="preserve">small local model on 0 of 30, with all faulty text blocked. The checker as</w:t>
-      </w:r>
-      <w:r>
-        <w:t xml:space="preserve"> </w:t>
-      </w:r>
-      <w:r>
-        <w:t xml:space="preserve">first released missed 709 of 3334 mutated explanations; the corrected</w:t>
-      </w:r>
-      <w:r>
-        <w:t xml:space="preserve"> </w:t>
-      </w:r>
-      <w:r>
-        <w:t xml:space="preserve">checker caught all. A blinded audit found 3 of 20 accepted explanations</w:t>
-      </w:r>
-      <w:r>
-        <w:t xml:space="preserve"> </w:t>
-      </w:r>
-      <w:r>
-        <w:t xml:space="preserve">misleading (limit 2): correct numbers attached to the wrong concept.</w:t>
+        <w:t xml:space="preserve">1/f confound it targeted; on a held-out subject of the public CHB-MIT</w:t>
+      </w:r>
+      <w:r>
+        <w:t xml:space="preserve"> </w:t>
+      </w:r>
+      <w:r>
+        <w:t xml:space="preserve">database the frozen detector found 4 of 7 seizures at 3.3 false detections</w:t>
+      </w:r>
+      <w:r>
+        <w:t xml:space="preserve"> </w:t>
+      </w:r>
+      <w:r>
+        <w:t xml:space="preserve">per hour. A cloud language model met the citation contract on 30 of 30</w:t>
+      </w:r>
+      <w:r>
+        <w:t xml:space="preserve"> </w:t>
+      </w:r>
+      <w:r>
+        <w:t xml:space="preserve">recordings and a small local model on 0 of 30, with all faulty text blocked.</w:t>
+      </w:r>
+      <w:r>
+        <w:t xml:space="preserve"> </w:t>
+      </w:r>
+      <w:r>
+        <w:t xml:space="preserve">The first checker missed 709 of 3334 mutated explanations; the corrected one</w:t>
+      </w:r>
+      <w:r>
+        <w:t xml:space="preserve"> </w:t>
+      </w:r>
+      <w:r>
+        <w:t xml:space="preserve">caught all. A blinded audit found 3 of 20 accepted explanations misleading</w:t>
+      </w:r>
+      <w:r>
+        <w:t xml:space="preserve"> </w:t>
+      </w:r>
+      <w:r>
+        <w:t xml:space="preserve">(limit 2): correct numbers attached to the wrong concept.</w:t>
       </w:r>
     </w:p>
     <w:p>

</xml_diff>